<commit_message>
Refine v2 per full Zoom notes: human baseline, metrics order, ViewItem detail
Cross-checked the complete meeting transcript against the draft; three
refinements (rest already addressed):
- Evaluation (Huayu): make the human baseline explicit — correctness scored
  against the developers' own withheld PR set; time measured against today's
  human review cost; convention gate = code-review validation
- Metrics for success: reorder to match where the effort goes (retrieval-strategy
  comparison first, then the applied review-cycle outcome)
- Impact: enrich the ViewItem example with Ramesh's concrete features
  (a "selling fast" indicator / price-drop badge across 5+ services)

Re-synced .tex (7 pp, clean), .docx + markdown, and website.

Co-Authored-By: Claude Opus 4.8 <noreply@anthropic.com>
</commit_message>
<xml_diff>
--- a/proposal/eRUPT-proposal-v2.docx
+++ b/proposal/eRUPT-proposal-v2.docx
@@ -999,7 +999,7 @@
         <w:t xml:space="preserve"> </w:t>
       </w:r>
       <w:r>
-        <w:t xml:space="preserve">We run all three strategies on a held-out benchmark drawn from the case study’s own history, in three task families: cross-repository feature synthesis (scored against known ground-truth PR sets), onboarding and dependency questions, and review tasks with seeded convention and cross-repository contract violations. The substrate state, agent model, prompt template, task set, and compute budget are held fixed and only the retriever is swapped, so every comparison is paired within-task and the measured difference is attributable to retrieval alone. Two baselines — no retrieval (LLM priors only) and current-snapshot retrieval (no history) — bound each strategy’s contribution and test whether the history substrate pays off at all. We report outcomes along three axes tied to the project’s goals:</w:t>
+        <w:t xml:space="preserve">We run all three strategies on a held-out benchmark drawn from the case study’s own history, in three task families: cross-repository feature synthesis (scored against known ground-truth PR sets), onboarding and dependency questions, and review tasks with seeded convention and cross-repository contract violations. The substrate state, agent model, prompt template, task set, and compute budget are held fixed and only the retriever is swapped, so every comparison is paired within-task and the measured difference is attributable to retrieval alone. Correctness is measured against the developers’ own solution: the actual pull-request set that resolved each task is withheld and used as ground truth, so agent output is compared to what a human in fact shipped. Three baselines calibrate the result — that human solution (the reference point), no retrieval (LLM priors only), and current-snapshot retrieval (no history); the latter two test whether the history substrate pays off at all. We report outcomes along three axes tied to the project’s goals:</w:t>
       </w:r>
       <w:r>
         <w:t xml:space="preserve"> </w:t>
@@ -1015,7 +1015,7 @@
         <w:t xml:space="preserve"> </w:t>
       </w:r>
       <w:r>
-        <w:t xml:space="preserve">(review-cycle time and comments per agent-generated PR; onboarding time-to-answer),</w:t>
+        <w:t xml:space="preserve">(review-cycle time and reviewer hours per agent-generated PR, measured against today’s human review cost; onboarding time-to-answer),</w:t>
       </w:r>
       <w:r>
         <w:t xml:space="preserve"> </w:t>
@@ -1143,7 +1143,19 @@
         <w:t xml:space="preserve"> </w:t>
       </w:r>
       <w:r>
-        <w:t xml:space="preserve">an agent grounded in mined history scaffolds changes that correctly span the services a feature touches — adding a new signal to the ViewItem page, for example, today reaches five or more services and can take weeks — attacking the year-plus feature cycle at its most error-prone seam.</w:t>
+        <w:t xml:space="preserve">an agent grounded in mined history scaffolds changes that correctly span the services a feature touches — adding a new signal to the ViewItem page, such as a</w:t>
+      </w:r>
+      <w:r>
+        <w:t xml:space="preserve"> </w:t>
+      </w:r>
+      <w:r>
+        <w:t xml:space="preserve">“selling fast”</w:t>
+      </w:r>
+      <w:r>
+        <w:t xml:space="preserve"> </w:t>
+      </w:r>
+      <w:r>
+        <w:t xml:space="preserve">indicator or a price-drop badge, today means identifying and wiring together five or more separate services and can take weeks — attacking the year-plus feature cycle at its most error-prone seam.</w:t>
       </w:r>
       <w:r>
         <w:t xml:space="preserve"> </w:t>
@@ -1387,13 +1399,42 @@
           <w:b/>
           <w:bCs/>
         </w:rPr>
-        <w:t xml:space="preserve">Metrics for success:</w:t>
-      </w:r>
-      <w:r>
-        <w:t xml:space="preserve"> </w:t>
-      </w:r>
-      <w:r>
-        <w:t xml:space="preserve">primary — reduction in review-cycle time / review comments per agent-generated PR; secondary — cross-repository feature-scaffold accuracy; supporting — retrieval precision/recall and onboarding-task success. These are reported with statistics appropriate to a controlled comparison: paired significance tests across the three strategies (Friedman, with post-hoc Wilcoxon signed-rank and multiple-comparison correction), effect sizes (Cliff’s δ) reported alongside p-values, bootstrap 95% confidence intervals on every delta, and inter-rater agreement (Krippendorff’s α) for human-judged scaffold quality. Tiered funding could support progressive expansion to additional repositories and pattern types across eBay’s organization.</w:t>
+        <w:t xml:space="preserve">Metrics for success</w:t>
+      </w:r>
+      <w:r>
+        <w:t xml:space="preserve">, ordered to match where the effort goes: first, the</w:t>
+      </w:r>
+      <w:r>
+        <w:t xml:space="preserve"> </w:t>
+      </w:r>
+      <w:r>
+        <w:rPr>
+          <w:i/>
+          <w:iCs/>
+        </w:rPr>
+        <w:t xml:space="preserve">retrieval-strategy comparison</w:t>
+      </w:r>
+      <w:r>
+        <w:t xml:space="preserve"> </w:t>
+      </w:r>
+      <w:r>
+        <w:t xml:space="preserve">itself — retrieval precision/recall and cross-repository feature-scaffold accuracy across the three strategies, isolating which is most efficient (the core result); then the</w:t>
+      </w:r>
+      <w:r>
+        <w:t xml:space="preserve"> </w:t>
+      </w:r>
+      <w:r>
+        <w:rPr>
+          <w:i/>
+          <w:iCs/>
+        </w:rPr>
+        <w:t xml:space="preserve">applied outcome</w:t>
+      </w:r>
+      <w:r>
+        <w:t xml:space="preserve"> </w:t>
+      </w:r>
+      <w:r>
+        <w:t xml:space="preserve">that motivates it — reduction in review-cycle time and reviewer effort per agent-generated PR; and, supporting, onboarding-task success. These are reported with statistics appropriate to a controlled comparison: paired significance tests across the three strategies (Friedman, with post-hoc Wilcoxon signed-rank and multiple-comparison correction), effect sizes (Cliff’s δ) reported alongside p-values, bootstrap 95% confidence intervals on every delta, and inter-rater agreement (Krippendorff’s α) for human-judged scaffold quality. Tiered funding could support progressive expansion to additional repositories and pattern types across eBay’s organization.</w:t>
       </w:r>
     </w:p>
     <w:bookmarkEnd w:id="26"/>

</xml_diff>

<commit_message>
Redesign methodology figure: short box titles, detail moved to captions
The previous figure was text-heavy and the green "THE EXPERIMENT" box wrapped
to two lines. Redesign: one-line box titles (Code history / Family of graphs /
Retrieval experiment / Cross-repo synthesis / Convention validation), with the
per-stage detail moved out to light captions beneath each box. Wrapped in
\resizebox{\textwidth} so it always fits. Regenerated the figure PNG and
re-synced the .docx, website PDF, and figure asset.

Co-Authored-By: Claude Opus 4.8 <noreply@anthropic.com>
</commit_message>
<xml_diff>
--- a/proposal/eRUPT-proposal-v2.docx
+++ b/proposal/eRUPT-proposal-v2.docx
@@ -778,7 +778,7 @@
       <w:r>
         <w:drawing>
           <wp:inline>
-            <wp:extent cx="5495589" cy="1943674"/>
+            <wp:extent cx="5943600" cy="1321246"/>
             <wp:effectExtent b="0" l="0" r="0" t="0"/>
             <wp:docPr descr="Methodology pipeline. A provenance-tagged, multi-repository version-control history is mined once into a family of graphs; holding that substrate fixed, we run the head-to-head comparison of three retrieval strategies (the core contribution, in green). The best strategy then drives cross-repository feature synthesis and a convention-validation gate over the resulting pull requests." title="" id="22" name="Picture"/>
             <a:graphic>
@@ -799,7 +799,7 @@
                   <pic:spPr bwMode="auto">
                     <a:xfrm>
                       <a:off x="0" y="0"/>
-                      <a:ext cx="5495589" cy="1943674"/>
+                      <a:ext cx="5943600" cy="1321246"/>
                     </a:xfrm>
                     <a:prstGeom prst="rect">
                       <a:avLst/>

</xml_diff>

<commit_message>
Reconcile references across all artifacts with Chris's post-merge fixes
Chris pushed e7f5857 "Fixing references" to main, editing only v2-main.tex.
This propagates those fixes to every derived artifact so the submission package
is consistent:
- [1] retitled "From Papers to Progress: Rethinking Knowledge Accumulation in
  Software Engineering" (arXiv:2604.16208)
- arXiv IDs added to [4],[13],[15],[16],[17],[18],[19],[21]
- [8] venue -> "Proc. IEEE SLAAI-ICAI"; [20] -> "University of Limerick"
- Synced references.json (canonical), citation-matrix.md, eRUPT-proposal-v2.md,
  regenerated .docx, docs/index.html, docs/proposal-v2.pdf; republished artifact
- Memory-bank: PR #10 merged; lab name CONFIRMED "Code World No Blanket"

Co-Authored-By: Claude Opus 4.8 <noreply@anthropic.com>
</commit_message>
<xml_diff>
--- a/proposal/eRUPT-proposal-v2.docx
+++ b/proposal/eRUPT-proposal-v2.docx
@@ -1520,13 +1520,13 @@
         <w:t xml:space="preserve"> </w:t>
       </w:r>
       <w:r>
-        <w:t xml:space="preserve">“A Case for Structured Knowledge Accumulation in Software Engineering Research.”</w:t>
-      </w:r>
-      <w:r>
-        <w:t xml:space="preserve"> </w:t>
-      </w:r>
-      <w:r>
-        <w:t xml:space="preserve">Proc. ICSE-FOSE, 2026.</w:t>
+        <w:t xml:space="preserve">“From Papers to Progress: Rethinking Knowledge Accumulation in Software Engineering.”</w:t>
+      </w:r>
+      <w:r>
+        <w:t xml:space="preserve"> </w:t>
+      </w:r>
+      <w:r>
+        <w:t xml:space="preserve">Proc. ICSE-FOSE, arXiv:2604.16208, 2026.</w:t>
       </w:r>
     </w:p>
     <w:p>
@@ -1577,7 +1577,7 @@
         <w:t xml:space="preserve"> </w:t>
       </w:r>
       <w:r>
-        <w:t xml:space="preserve">arXiv, 2025.</w:t>
+        <w:t xml:space="preserve">arXiv:2511.07584, 2025.</w:t>
       </w:r>
     </w:p>
     <w:p>
@@ -1648,7 +1648,7 @@
         <w:t xml:space="preserve"> </w:t>
       </w:r>
       <w:r>
-        <w:t xml:space="preserve">SLAAI-ICAI, 2025.</w:t>
+        <w:t xml:space="preserve">Proc. IEEE SLAAI-ICAI, 2025.</w:t>
       </w:r>
     </w:p>
     <w:p>
@@ -1739,7 +1739,7 @@
         <w:t xml:space="preserve"> </w:t>
       </w:r>
       <w:r>
-        <w:t xml:space="preserve">arXiv, 2025.</w:t>
+        <w:t xml:space="preserve">arXiv:2509.19708, 2025.</w:t>
       </w:r>
     </w:p>
     <w:p>
@@ -1776,7 +1776,7 @@
         <w:t xml:space="preserve"> </w:t>
       </w:r>
       <w:r>
-        <w:t xml:space="preserve">arXiv, 2026.</w:t>
+        <w:t xml:space="preserve">arXiv:2604.13102, 2026.</w:t>
       </w:r>
     </w:p>
     <w:p>
@@ -1793,7 +1793,7 @@
         <w:t xml:space="preserve"> </w:t>
       </w:r>
       <w:r>
-        <w:t xml:space="preserve">arXiv, 2026.</w:t>
+        <w:t xml:space="preserve">arXiv:2603.26664, 2026.</w:t>
       </w:r>
     </w:p>
     <w:p>
@@ -1810,7 +1810,7 @@
         <w:t xml:space="preserve"> </w:t>
       </w:r>
       <w:r>
-        <w:t xml:space="preserve">arXiv, 2025.</w:t>
+        <w:t xml:space="preserve">arXiv:2507.19942, 2025.</w:t>
       </w:r>
     </w:p>
     <w:p>
@@ -1827,7 +1827,7 @@
         <w:t xml:space="preserve"> </w:t>
       </w:r>
       <w:r>
-        <w:t xml:space="preserve">arXiv, 2025.</w:t>
+        <w:t xml:space="preserve">arXiv:2510.10942, 2025.</w:t>
       </w:r>
     </w:p>
     <w:p>
@@ -1847,7 +1847,7 @@
         <w:t xml:space="preserve"> </w:t>
       </w:r>
       <w:r>
-        <w:t xml:space="preserve">arXiv, 2026.</w:t>
+        <w:t xml:space="preserve">arXiv:2602.20478, 2026.</w:t>
       </w:r>
     </w:p>
     <w:p>
@@ -1867,7 +1867,7 @@
         <w:t xml:space="preserve"> </w:t>
       </w:r>
       <w:r>
-        <w:t xml:space="preserve">2025.</w:t>
+        <w:t xml:space="preserve">University of Limerick, 2025.</w:t>
       </w:r>
     </w:p>
     <w:p>
@@ -1884,7 +1884,7 @@
         <w:t xml:space="preserve"> </w:t>
       </w:r>
       <w:r>
-        <w:t xml:space="preserve">arXiv, 2025.</w:t>
+        <w:t xml:space="preserve">arXiv:2512.15922, 2025.</w:t>
       </w:r>
     </w:p>
     <w:p>

</xml_diff>